<commit_message>
Derinleştirmeden sonra bütün çıktıları yeniden derle
16 sunum HTML + PDF + PPTX, 16 ders notu PDF + DOCX, 16 materyal paketi
(TR ve EN) tazelendi. Öğretim haftalarının desteleri artık 186-203
slayt; proje ve sınav haftaları 31-39 slaytta kaldı (beklenen).

Derleme hatasız tamamlandı.

Co-Authored-By: Claude Opus 5 (1M context) <noreply@anthropic.com>
</commit_message>
<xml_diff>
--- a/docs/week-3/cen429-week-3-ders-notu.en.docx
+++ b/docs/week-3/cen429-week-3-ders-notu.en.docx
@@ -2,7 +2,7 @@
 <file path=word/document.xml><?xml version="1.0" encoding="utf-8"?>
 <w:document xmlns:w="http://schemas.openxmlformats.org/wordprocessingml/2006/main" xmlns:m="http://schemas.openxmlformats.org/officeDocument/2006/math" xmlns:r="http://schemas.openxmlformats.org/officeDocument/2006/relationships" xmlns:o="urn:schemas-microsoft-com:office:office" xmlns:v="urn:schemas-microsoft-com:vml" xmlns:w10="urn:schemas-microsoft-com:office:word" xmlns:a="http://schemas.openxmlformats.org/drawingml/2006/main" xmlns:pic="http://schemas.openxmlformats.org/drawingml/2006/picture" xmlns:wp="http://schemas.openxmlformats.org/drawingml/2006/wordprocessingDrawing">
   <w:body>
-    <w:bookmarkStart w:id="151" w:name="X417ac541db43efdef0562fbd974c7dac07737a9"/>
+    <w:bookmarkStart w:id="178" w:name="X417ac541db43efdef0562fbd974c7dac07737a9"/>
     <w:p>
       <w:pPr>
         <w:pStyle w:val="Heading1"/>
@@ -4658,7 +4658,7 @@
       </w:r>
     </w:p>
     <w:bookmarkEnd w:id="43"/>
-    <w:bookmarkStart w:id="49" w:name="X25c055d5a85e2e6e0e27584e277c3d4d51a6345"/>
+    <w:bookmarkStart w:id="52" w:name="X25c055d5a85e2e6e0e27584e277c3d4d51a6345"/>
     <w:p>
       <w:pPr>
         <w:pStyle w:val="Heading2"/>
@@ -4695,6 +4695,53 @@
       </w:r>
       <w:r>
         <w:t xml:space="preserve">netleştirelim.</w:t>
+      </w:r>
+    </w:p>
+    <w:p>
+      <w:pPr>
+        <w:pStyle w:val="BodyText"/>
+      </w:pPr>
+      <w:r>
+        <w:drawing>
+          <wp:inline>
+            <wp:extent cx="5759999" cy="2654976"/>
+            <wp:effectExtent b="0" l="0" r="0" t="0"/>
+            <wp:docPr descr="Kriptografinin dört ailesi" title="" id="45" name="Picture"/>
+            <a:graphic>
+              <a:graphicData uri="http://schemas.openxmlformats.org/drawingml/2006/picture">
+                <pic:pic>
+                  <pic:nvPicPr>
+                    <pic:cNvPr descr="h03-12-kripto-aileleri.png" id="46" name="Picture"/>
+                    <pic:cNvPicPr>
+                      <a:picLocks noChangeArrowheads="1" noChangeAspect="1"/>
+                    </pic:cNvPicPr>
+                  </pic:nvPicPr>
+                  <pic:blipFill>
+                    <a:blip r:embed="rId44"/>
+                    <a:stretch>
+                      <a:fillRect/>
+                    </a:stretch>
+                  </pic:blipFill>
+                  <pic:spPr bwMode="auto">
+                    <a:xfrm>
+                      <a:off x="0" y="0"/>
+                      <a:ext cx="5759999" cy="2654976"/>
+                    </a:xfrm>
+                    <a:prstGeom prst="rect">
+                      <a:avLst/>
+                    </a:prstGeom>
+                    <a:noFill/>
+                    <a:ln w="9525">
+                      <a:noFill/>
+                      <a:headEnd/>
+                      <a:tailEnd/>
+                    </a:ln>
+                  </pic:spPr>
+                </pic:pic>
+              </a:graphicData>
+            </a:graphic>
+          </wp:inline>
+        </w:drawing>
       </w:r>
     </w:p>
     <w:tbl>
@@ -5291,7 +5338,7 @@
         <w:t xml:space="preserve">gizliliğine dayanmalı. Standart, denenmiş yapıları kullanın.</w:t>
       </w:r>
     </w:p>
-    <w:bookmarkStart w:id="44" w:name="X6c620068f12675b9f004ab885f218d425a094e2"/>
+    <w:bookmarkStart w:id="47" w:name="X6c620068f12675b9f004ab885f218d425a094e2"/>
     <w:p>
       <w:pPr>
         <w:pStyle w:val="Heading3"/>
@@ -5554,8 +5601,8 @@
         <w:t xml:space="preserve">’de geçer; AEAD bunun tek çağrıya inmiş hâlidir.</w:t>
       </w:r>
     </w:p>
-    <w:bookmarkEnd w:id="44"/>
-    <w:bookmarkStart w:id="45" w:name="X890a2f0b6bd2bf417d5bba5e55d68a951a1b316"/>
+    <w:bookmarkEnd w:id="47"/>
+    <w:bookmarkStart w:id="48" w:name="X890a2f0b6bd2bf417d5bba5e55d68a951a1b316"/>
     <w:p>
       <w:pPr>
         <w:pStyle w:val="Heading3"/>
@@ -5886,8 +5933,8 @@
         </w:tc>
       </w:tr>
     </w:tbl>
-    <w:bookmarkEnd w:id="45"/>
-    <w:bookmarkStart w:id="46" w:name="blok-mü-akış-mı-kip-mode-neden-önemli"/>
+    <w:bookmarkEnd w:id="48"/>
+    <w:bookmarkStart w:id="49" w:name="blok-mü-akış-mı-kip-mode-neden-önemli"/>
     <w:p>
       <w:pPr>
         <w:pStyle w:val="Heading3"/>
@@ -6126,8 +6173,8 @@
         <w:t xml:space="preserve">gizlilik + bütünlük tek pakette.</w:t>
       </w:r>
     </w:p>
-    <w:bookmarkEnd w:id="46"/>
-    <w:bookmarkStart w:id="47" w:name="özet-mac-ve-imza-hangisi-ne-zaman"/>
+    <w:bookmarkEnd w:id="49"/>
+    <w:bookmarkStart w:id="50" w:name="özet-mac-ve-imza-hangisi-ne-zaman"/>
     <w:p>
       <w:pPr>
         <w:pStyle w:val="Heading3"/>
@@ -6637,8 +6684,8 @@
         <w:t xml:space="preserve">şifrelenmeyecek ama bütünlüğü gereken veriler için (ya da AEAD’nin AAD alanıyla) gerekir.</w:t>
       </w:r>
     </w:p>
-    <w:bookmarkEnd w:id="47"/>
-    <w:bookmarkStart w:id="48" w:name="X20ea211bcf1d66c908c83e69e408388e87e63a5"/>
+    <w:bookmarkEnd w:id="50"/>
+    <w:bookmarkStart w:id="51" w:name="X20ea211bcf1d66c908c83e69e408388e87e63a5"/>
     <w:p>
       <w:pPr>
         <w:pStyle w:val="Heading3"/>
@@ -8117,9 +8164,9 @@
         </w:pict>
       </w:r>
     </w:p>
-    <w:bookmarkEnd w:id="48"/>
-    <w:bookmarkEnd w:id="49"/>
-    <w:bookmarkStart w:id="56" w:name="Xd3368e84913e183ff92e38ca56ca7b6c3fafee4"/>
+    <w:bookmarkEnd w:id="51"/>
+    <w:bookmarkEnd w:id="52"/>
+    <w:bookmarkStart w:id="62" w:name="Xd3368e84913e183ff92e38ca56ca7b6c3fafee4"/>
     <w:p>
       <w:pPr>
         <w:pStyle w:val="Heading2"/>
@@ -8161,7 +8208,54 @@
         <w:t xml:space="preserve">adım işleyeceğiz.</w:t>
       </w:r>
     </w:p>
-    <w:bookmarkStart w:id="50" w:name="üç-tür-rastgele"/>
+    <w:p>
+      <w:pPr>
+        <w:pStyle w:val="BodyText"/>
+      </w:pPr>
+      <w:r>
+        <w:drawing>
+          <wp:inline>
+            <wp:extent cx="5759999" cy="2379540"/>
+            <wp:effectExtent b="0" l="0" r="0" t="0"/>
+            <wp:docPr descr="Üç tür rastgelelik ve kullanım yerleri" title="" id="54" name="Picture"/>
+            <a:graphic>
+              <a:graphicData uri="http://schemas.openxmlformats.org/drawingml/2006/picture">
+                <pic:pic>
+                  <pic:nvPicPr>
+                    <pic:cNvPr descr="h03-13-rastgelelik-turleri.png" id="55" name="Picture"/>
+                    <pic:cNvPicPr>
+                      <a:picLocks noChangeArrowheads="1" noChangeAspect="1"/>
+                    </pic:cNvPicPr>
+                  </pic:nvPicPr>
+                  <pic:blipFill>
+                    <a:blip r:embed="rId53"/>
+                    <a:stretch>
+                      <a:fillRect/>
+                    </a:stretch>
+                  </pic:blipFill>
+                  <pic:spPr bwMode="auto">
+                    <a:xfrm>
+                      <a:off x="0" y="0"/>
+                      <a:ext cx="5759999" cy="2379540"/>
+                    </a:xfrm>
+                    <a:prstGeom prst="rect">
+                      <a:avLst/>
+                    </a:prstGeom>
+                    <a:noFill/>
+                    <a:ln w="9525">
+                      <a:noFill/>
+                      <a:headEnd/>
+                      <a:tailEnd/>
+                    </a:ln>
+                  </pic:spPr>
+                </pic:pic>
+              </a:graphicData>
+            </a:graphic>
+          </wp:inline>
+        </w:drawing>
+      </w:r>
+    </w:p>
+    <w:bookmarkStart w:id="56" w:name="üç-tür-rastgele"/>
     <w:p>
       <w:pPr>
         <w:pStyle w:val="Heading3"/>
@@ -8541,8 +8635,8 @@
         <w:t xml:space="preserve">çıktısını gören biri, sonraki bütün çıktıları hesaplayabilir.</w:t>
       </w:r>
     </w:p>
-    <w:bookmarkEnd w:id="50"/>
-    <w:bookmarkStart w:id="51" w:name="hata-1-zamanla-tohumlamak"/>
+    <w:bookmarkEnd w:id="56"/>
+    <w:bookmarkStart w:id="57" w:name="hata-1-zamanla-tohumlamak"/>
     <w:p>
       <w:pPr>
         <w:pStyle w:val="Heading3"/>
@@ -8861,8 +8955,8 @@
         <w:t xml:space="preserve">dizi bilinir.</w:t>
       </w:r>
     </w:p>
-    <w:bookmarkEnd w:id="51"/>
-    <w:bookmarkStart w:id="52" w:name="hata-2-entropiyi-yanlışlıkla-silmek"/>
+    <w:bookmarkEnd w:id="57"/>
+    <w:bookmarkStart w:id="58" w:name="hata-2-entropiyi-yanlışlıkla-silmek"/>
     <w:p>
       <w:pPr>
         <w:pStyle w:val="Heading3"/>
@@ -8953,8 +9047,8 @@
         <w:t xml:space="preserve">edilemezliğini kanıtlamaz.</w:t>
       </w:r>
     </w:p>
-    <w:bookmarkEnd w:id="52"/>
-    <w:bookmarkStart w:id="53" w:name="doğru-yol-işletim-sisteminin-üreteci"/>
+    <w:bookmarkEnd w:id="58"/>
+    <w:bookmarkStart w:id="59" w:name="doğru-yol-işletim-sisteminin-üreteci"/>
     <w:p>
       <w:pPr>
         <w:pStyle w:val="Heading3"/>
@@ -10402,8 +10496,8 @@
         <w:t xml:space="preserve">işlemi durdurmaktır.</w:t>
       </w:r>
     </w:p>
-    <w:bookmarkEnd w:id="53"/>
-    <w:bookmarkStart w:id="54" w:name="Xed0eac218c85cb5b1ac059af47703a0185526c0"/>
+    <w:bookmarkEnd w:id="59"/>
+    <w:bookmarkStart w:id="60" w:name="Xed0eac218c85cb5b1ac059af47703a0185526c0"/>
     <w:p>
       <w:pPr>
         <w:pStyle w:val="Heading3"/>
@@ -10917,8 +11011,8 @@
         <w:t xml:space="preserve">sayıda girdiden gelir.</w:t>
       </w:r>
     </w:p>
-    <w:bookmarkEnd w:id="54"/>
-    <w:bookmarkStart w:id="55" w:name="X7644cdc29c6a55ec29595436e4d7e25bb041e2c"/>
+    <w:bookmarkEnd w:id="60"/>
+    <w:bookmarkStart w:id="61" w:name="X7644cdc29c6a55ec29595436e4d7e25bb041e2c"/>
     <w:p>
       <w:pPr>
         <w:pStyle w:val="Heading3"/>
@@ -11631,9 +11725,9 @@
         </w:pict>
       </w:r>
     </w:p>
-    <w:bookmarkEnd w:id="55"/>
-    <w:bookmarkEnd w:id="56"/>
-    <w:bookmarkStart w:id="66" w:name="X1362a296e05ebdb2d375d2609e02af907fc6a12"/>
+    <w:bookmarkEnd w:id="61"/>
+    <w:bookmarkEnd w:id="62"/>
+    <w:bookmarkStart w:id="72" w:name="X1362a296e05ebdb2d375d2609e02af907fc6a12"/>
     <w:p>
       <w:pPr>
         <w:pStyle w:val="Heading2"/>
@@ -11728,7 +11822,7 @@
         <w:t xml:space="preserve">da bir beceridir.</w:t>
       </w:r>
     </w:p>
-    <w:bookmarkStart w:id="60" w:name="aeadin-dört-girdisi-ve-iki-çıktısı"/>
+    <w:bookmarkStart w:id="66" w:name="aeadin-dört-girdisi-ve-iki-çıktısı"/>
     <w:p>
       <w:pPr>
         <w:pStyle w:val="Heading3"/>
@@ -11746,18 +11840,18 @@
           <wp:inline>
             <wp:extent cx="5759999" cy="2561342"/>
             <wp:effectExtent b="0" l="0" r="0" t="0"/>
-            <wp:docPr descr="AEAD’in dört girdisi ve iki çıktısı" title="" id="58" name="Picture"/>
+            <wp:docPr descr="AEAD’in dört girdisi ve iki çıktısı" title="" id="64" name="Picture"/>
             <a:graphic>
               <a:graphicData uri="http://schemas.openxmlformats.org/drawingml/2006/picture">
                 <pic:pic>
                   <pic:nvPicPr>
-                    <pic:cNvPr descr="h03-02-aead.png" id="59" name="Picture"/>
+                    <pic:cNvPr descr="h03-02-aead.png" id="65" name="Picture"/>
                     <pic:cNvPicPr>
                       <a:picLocks noChangeArrowheads="1" noChangeAspect="1"/>
                     </pic:cNvPicPr>
                   </pic:nvPicPr>
                   <pic:blipFill>
-                    <a:blip r:embed="rId57"/>
+                    <a:blip r:embed="rId63"/>
                     <a:stretch>
                       <a:fillRect/>
                     </a:stretch>
@@ -11814,8 +11908,8 @@
         <w:t xml:space="preserve">yineleme sayısını değiştirirse etiket tutmaz.</w:t>
       </w:r>
     </w:p>
-    <w:bookmarkEnd w:id="60"/>
-    <w:bookmarkStart w:id="61" w:name="openssl-evp-ile-şifreleme"/>
+    <w:bookmarkEnd w:id="66"/>
+    <w:bookmarkStart w:id="67" w:name="openssl-evp-ile-şifreleme"/>
     <w:p>
       <w:pPr>
         <w:pStyle w:val="Heading3"/>
@@ -14075,8 +14169,8 @@
         <w:t xml:space="preserve">kalıbıdır.</w:t>
       </w:r>
     </w:p>
-    <w:bookmarkEnd w:id="61"/>
-    <w:bookmarkStart w:id="62" w:name="X60a5c36ad02935ac9c60150b28d74749f51abdb"/>
+    <w:bookmarkEnd w:id="67"/>
+    <w:bookmarkStart w:id="68" w:name="X60a5c36ad02935ac9c60150b28d74749f51abdb"/>
     <w:p>
       <w:pPr>
         <w:pStyle w:val="Heading3"/>
@@ -16305,8 +16399,8 @@
         <w:t xml:space="preserve">Final başarılı olmadan açık metin yok sayılır ve silinir.</w:t>
       </w:r>
     </w:p>
-    <w:bookmarkEnd w:id="62"/>
-    <w:bookmarkStart w:id="63" w:name="windows-cng-ile-aynı-iş"/>
+    <w:bookmarkEnd w:id="68"/>
+    <w:bookmarkStart w:id="69" w:name="windows-cng-ile-aynı-iş"/>
     <w:p>
       <w:pPr>
         <w:pStyle w:val="Heading3"/>
@@ -18466,8 +18560,8 @@
         <w:t xml:space="preserve">bildirmesidir.</w:t>
       </w:r>
     </w:p>
-    <w:bookmarkEnd w:id="63"/>
-    <w:bookmarkStart w:id="64" w:name="sabit-zamanlı-karşılaştırma"/>
+    <w:bookmarkEnd w:id="69"/>
+    <w:bookmarkStart w:id="70" w:name="sabit-zamanlı-karşılaştırma"/>
     <w:p>
       <w:pPr>
         <w:pStyle w:val="Heading3"/>
@@ -19056,8 +19150,8 @@
         <w:t xml:space="preserve">.</w:t>
       </w:r>
     </w:p>
-    <w:bookmarkEnd w:id="64"/>
-    <w:bookmarkStart w:id="65" w:name="Xd286545b7eff55097f314b91e5fb4a0eee7fac3"/>
+    <w:bookmarkEnd w:id="70"/>
+    <w:bookmarkStart w:id="71" w:name="Xd286545b7eff55097f314b91e5fb4a0eee7fac3"/>
     <w:p>
       <w:pPr>
         <w:pStyle w:val="Heading3"/>
@@ -19394,9 +19488,9 @@
         </w:pict>
       </w:r>
     </w:p>
-    <w:bookmarkEnd w:id="65"/>
-    <w:bookmarkEnd w:id="66"/>
-    <w:bookmarkStart w:id="71" w:name="X604bb28520870f28f765f85da4d028becabd6e9"/>
+    <w:bookmarkEnd w:id="71"/>
+    <w:bookmarkEnd w:id="72"/>
+    <w:bookmarkStart w:id="80" w:name="X604bb28520870f28f765f85da4d028becabd6e9"/>
     <w:p>
       <w:pPr>
         <w:pStyle w:val="Heading2"/>
@@ -19451,6 +19545,53 @@
       </w:r>
       <w:r>
         <w:t xml:space="preserve">):</w:t>
+      </w:r>
+    </w:p>
+    <w:p>
+      <w:pPr>
+        <w:pStyle w:val="BodyText"/>
+      </w:pPr>
+      <w:r>
+        <w:drawing>
+          <wp:inline>
+            <wp:extent cx="5759999" cy="2654976"/>
+            <wp:effectExtent b="0" l="0" r="0" t="0"/>
+            <wp:docPr descr="Tuz, IV ve nonce arasındaki fark" title="" id="74" name="Picture"/>
+            <a:graphic>
+              <a:graphicData uri="http://schemas.openxmlformats.org/drawingml/2006/picture">
+                <pic:pic>
+                  <pic:nvPicPr>
+                    <pic:cNvPr descr="h03-14-tuz-iv-nonce.png" id="75" name="Picture"/>
+                    <pic:cNvPicPr>
+                      <a:picLocks noChangeArrowheads="1" noChangeAspect="1"/>
+                    </pic:cNvPicPr>
+                  </pic:nvPicPr>
+                  <pic:blipFill>
+                    <a:blip r:embed="rId73"/>
+                    <a:stretch>
+                      <a:fillRect/>
+                    </a:stretch>
+                  </pic:blipFill>
+                  <pic:spPr bwMode="auto">
+                    <a:xfrm>
+                      <a:off x="0" y="0"/>
+                      <a:ext cx="5759999" cy="2654976"/>
+                    </a:xfrm>
+                    <a:prstGeom prst="rect">
+                      <a:avLst/>
+                    </a:prstGeom>
+                    <a:noFill/>
+                    <a:ln w="9525">
+                      <a:noFill/>
+                      <a:headEnd/>
+                      <a:tailEnd/>
+                    </a:ln>
+                  </pic:spPr>
+                </pic:pic>
+              </a:graphicData>
+            </a:graphic>
+          </wp:inline>
+        </w:drawing>
       </w:r>
     </w:p>
     <w:tbl>
@@ -19705,7 +19846,7 @@
         </w:tc>
       </w:tr>
     </w:tbl>
-    <w:bookmarkStart w:id="67" w:name="nonce-yeniden-kullanımı-neden-felakettir"/>
+    <w:bookmarkStart w:id="76" w:name="nonce-yeniden-kullanımı-neden-felakettir"/>
     <w:p>
       <w:pPr>
         <w:pStyle w:val="Heading3"/>
@@ -19838,8 +19979,8 @@
         <w:t xml:space="preserve">diğerini tamamen çözer.</w:t>
       </w:r>
     </w:p>
-    <w:bookmarkEnd w:id="67"/>
-    <w:bookmarkStart w:id="68" w:name="X53a0548cfb03fc7318b110e5486feb58084a573"/>
+    <w:bookmarkEnd w:id="76"/>
+    <w:bookmarkStart w:id="77" w:name="X53a0548cfb03fc7318b110e5486feb58084a573"/>
     <w:p>
       <w:pPr>
         <w:pStyle w:val="Heading3"/>
@@ -20436,8 +20577,8 @@
         <w:t xml:space="preserve">çifti iki mesajda kullanılamaz, doğru mu?</w:t>
       </w:r>
     </w:p>
-    <w:bookmarkEnd w:id="68"/>
-    <w:bookmarkStart w:id="69" w:name="ecb-deseni-sızdırır"/>
+    <w:bookmarkEnd w:id="77"/>
+    <w:bookmarkStart w:id="78" w:name="ecb-deseni-sızdırır"/>
     <w:p>
       <w:pPr>
         <w:pStyle w:val="Heading3"/>
@@ -20508,8 +20649,8 @@
         <w:t xml:space="preserve">aynı şifreli bloğu verir; bu yüzden verideki tekrar eden desenler şifreli metinde de görünür.</w:t>
       </w:r>
     </w:p>
-    <w:bookmarkEnd w:id="69"/>
-    <w:bookmarkStart w:id="70" w:name="demo-3-ecb-pengueni-desen-sızıntısı"/>
+    <w:bookmarkEnd w:id="78"/>
+    <w:bookmarkStart w:id="79" w:name="demo-3-ecb-pengueni-desen-sızıntısı"/>
     <w:p>
       <w:pPr>
         <w:pStyle w:val="Heading3"/>
@@ -21040,9 +21181,9 @@
         </w:pict>
       </w:r>
     </w:p>
-    <w:bookmarkEnd w:id="70"/>
-    <w:bookmarkEnd w:id="71"/>
-    <w:bookmarkStart w:id="73" w:name="paroladan-anahtar-türetme"/>
+    <w:bookmarkEnd w:id="79"/>
+    <w:bookmarkEnd w:id="80"/>
+    <w:bookmarkStart w:id="85" w:name="paroladan-anahtar-türetme"/>
     <w:p>
       <w:pPr>
         <w:pStyle w:val="Heading2"/>
@@ -21063,6 +21204,53 @@
       </w:r>
       <w:r>
         <w:t xml:space="preserve">iki iş yapar:</w:t>
+      </w:r>
+    </w:p>
+    <w:p>
+      <w:pPr>
+        <w:pStyle w:val="BodyText"/>
+      </w:pPr>
+      <w:r>
+        <w:drawing>
+          <wp:inline>
+            <wp:extent cx="5759999" cy="2283460"/>
+            <wp:effectExtent b="0" l="0" r="0" t="0"/>
+            <wp:docPr descr="Paroladan anahtar türetme: tuz ve maliyet" title="" id="82" name="Picture"/>
+            <a:graphic>
+              <a:graphicData uri="http://schemas.openxmlformats.org/drawingml/2006/picture">
+                <pic:pic>
+                  <pic:nvPicPr>
+                    <pic:cNvPr descr="h03-15-kdf-iki-ek.png" id="83" name="Picture"/>
+                    <pic:cNvPicPr>
+                      <a:picLocks noChangeArrowheads="1" noChangeAspect="1"/>
+                    </pic:cNvPicPr>
+                  </pic:nvPicPr>
+                  <pic:blipFill>
+                    <a:blip r:embed="rId81"/>
+                    <a:stretch>
+                      <a:fillRect/>
+                    </a:stretch>
+                  </pic:blipFill>
+                  <pic:spPr bwMode="auto">
+                    <a:xfrm>
+                      <a:off x="0" y="0"/>
+                      <a:ext cx="5759999" cy="2283460"/>
+                    </a:xfrm>
+                    <a:prstGeom prst="rect">
+                      <a:avLst/>
+                    </a:prstGeom>
+                    <a:noFill/>
+                    <a:ln w="9525">
+                      <a:noFill/>
+                      <a:headEnd/>
+                      <a:tailEnd/>
+                    </a:ln>
+                  </pic:spPr>
+                </pic:pic>
+              </a:graphicData>
+            </a:graphic>
+          </wp:inline>
+        </w:drawing>
       </w:r>
     </w:p>
     <w:p>
@@ -21450,7 +21638,7 @@
         <w:t xml:space="preserve">tercih edilir.</w:t>
       </w:r>
     </w:p>
-    <w:bookmarkStart w:id="72" w:name="demo-4-tur-sayısı-süre-ve-tuzun-önemi"/>
+    <w:bookmarkStart w:id="84" w:name="demo-4-tur-sayısı-süre-ve-tuzun-önemi"/>
     <w:p>
       <w:pPr>
         <w:pStyle w:val="Heading3"/>
@@ -22034,9 +22222,9 @@
         </w:pict>
       </w:r>
     </w:p>
-    <w:bookmarkEnd w:id="72"/>
-    <w:bookmarkEnd w:id="73"/>
-    <w:bookmarkStart w:id="82" w:name="X330c77e2613466933a998e5d9e7c8eaceccd4ae"/>
+    <w:bookmarkEnd w:id="84"/>
+    <w:bookmarkEnd w:id="85"/>
+    <w:bookmarkStart w:id="94" w:name="X330c77e2613466933a998e5d9e7c8eaceccd4ae"/>
     <w:p>
       <w:pPr>
         <w:pStyle w:val="Heading2"/>
@@ -22193,18 +22381,18 @@
           <wp:inline>
             <wp:extent cx="5759999" cy="2377094"/>
             <wp:effectExtent b="0" l="0" r="0" t="0"/>
-            <wp:docPr descr="HKDF Extract ve Expand ile ana sırdan amaca özel anahtarlar" title="" id="75" name="Picture"/>
+            <wp:docPr descr="HKDF Extract ve Expand ile ana sırdan amaca özel anahtarlar" title="" id="87" name="Picture"/>
             <a:graphic>
               <a:graphicData uri="http://schemas.openxmlformats.org/drawingml/2006/picture">
                 <pic:pic>
                   <pic:nvPicPr>
-                    <pic:cNvPr descr="h03-03-hkdf.png" id="76" name="Picture"/>
+                    <pic:cNvPr descr="h03-03-hkdf.png" id="88" name="Picture"/>
                     <pic:cNvPicPr>
                       <a:picLocks noChangeArrowheads="1" noChangeAspect="1"/>
                     </pic:cNvPicPr>
                   </pic:nvPicPr>
                   <pic:blipFill>
-                    <a:blip r:embed="rId74"/>
+                    <a:blip r:embed="rId86"/>
                     <a:stretch>
                       <a:fillRect/>
                     </a:stretch>
@@ -22311,7 +22499,7 @@
         <w:t xml:space="preserve">(info/label) içermesi şarttır.</w:t>
       </w:r>
     </w:p>
-    <w:bookmarkStart w:id="80" w:name="ileri-gizlilik-forward-secrecy"/>
+    <w:bookmarkStart w:id="92" w:name="ileri-gizlilik-forward-secrecy"/>
     <w:p>
       <w:pPr>
         <w:pStyle w:val="Heading3"/>
@@ -22475,18 +22663,18 @@
           <wp:inline>
             <wp:extent cx="5759999" cy="2574688"/>
             <wp:effectExtent b="0" l="0" r="0" t="0"/>
-            <wp:docPr descr="İleri gizlilik: tek yönlü anahtar zinciri" title="" id="78" name="Picture"/>
+            <wp:docPr descr="İleri gizlilik: tek yönlü anahtar zinciri" title="" id="90" name="Picture"/>
             <a:graphic>
               <a:graphicData uri="http://schemas.openxmlformats.org/drawingml/2006/picture">
                 <pic:pic>
                   <pic:nvPicPr>
-                    <pic:cNvPr descr="h03-11-ileri-gizlilik.png" id="79" name="Picture"/>
+                    <pic:cNvPr descr="h03-11-ileri-gizlilik.png" id="91" name="Picture"/>
                     <pic:cNvPicPr>
                       <a:picLocks noChangeArrowheads="1" noChangeAspect="1"/>
                     </pic:cNvPicPr>
                   </pic:nvPicPr>
                   <pic:blipFill>
-                    <a:blip r:embed="rId77"/>
+                    <a:blip r:embed="rId89"/>
                     <a:stretch>
                       <a:fillRect/>
                     </a:stretch>
@@ -22513,8 +22701,8 @@
         </w:drawing>
       </w:r>
     </w:p>
-    <w:bookmarkEnd w:id="80"/>
-    <w:bookmarkStart w:id="81" w:name="Xf633e11f442e30a1a37838e2494d28192dc9b7b"/>
+    <w:bookmarkEnd w:id="92"/>
+    <w:bookmarkStart w:id="93" w:name="Xf633e11f442e30a1a37838e2494d28192dc9b7b"/>
     <w:p>
       <w:pPr>
         <w:pStyle w:val="Heading3"/>
@@ -22988,9 +23176,9 @@
         </w:pict>
       </w:r>
     </w:p>
-    <w:bookmarkEnd w:id="81"/>
-    <w:bookmarkEnd w:id="82"/>
-    <w:bookmarkStart w:id="102" w:name="X645f7239ddccf04b7f47f9ed71eb6c3fb69ef3d"/>
+    <w:bookmarkEnd w:id="93"/>
+    <w:bookmarkEnd w:id="94"/>
+    <w:bookmarkStart w:id="114" w:name="X645f7239ddccf04b7f47f9ed71eb6c3fb69ef3d"/>
     <w:p>
       <w:pPr>
         <w:pStyle w:val="Heading2"/>
@@ -23047,7 +23235,7 @@
         <w:t xml:space="preserve">bölümde konuyu sahada kullanılan biçimiyle genişletiyoruz.</w:t>
       </w:r>
     </w:p>
-    <w:bookmarkStart w:id="86" w:name="bir-anahtarın-hayatı"/>
+    <w:bookmarkStart w:id="98" w:name="bir-anahtarın-hayatı"/>
     <w:p>
       <w:pPr>
         <w:pStyle w:val="Heading3"/>
@@ -23073,18 +23261,18 @@
           <wp:inline>
             <wp:extent cx="5759999" cy="2561342"/>
             <wp:effectExtent b="0" l="0" r="0" t="0"/>
-            <wp:docPr descr="Anahtarın yaşam döngüsü: üretim, dağıtım, etkin, pasif, imha" title="" id="84" name="Picture"/>
+            <wp:docPr descr="Anahtarın yaşam döngüsü: üretim, dağıtım, etkin, pasif, imha" title="" id="96" name="Picture"/>
             <a:graphic>
               <a:graphicData uri="http://schemas.openxmlformats.org/drawingml/2006/picture">
                 <pic:pic>
                   <pic:nvPicPr>
-                    <pic:cNvPr descr="h03-04-anahtar-yasam-dongusu.png" id="85" name="Picture"/>
+                    <pic:cNvPr descr="h03-04-anahtar-yasam-dongusu.png" id="97" name="Picture"/>
                     <pic:cNvPicPr>
                       <a:picLocks noChangeArrowheads="1" noChangeAspect="1"/>
                     </pic:cNvPicPr>
                   </pic:nvPicPr>
                   <pic:blipFill>
-                    <a:blip r:embed="rId83"/>
+                    <a:blip r:embed="rId95"/>
                     <a:stretch>
                       <a:fillRect/>
                     </a:stretch>
@@ -23500,8 +23688,8 @@
         <w:t xml:space="preserve">açıkta durduğu. İstemci cihazında duran bir anahtar, HSM’de duran bir anahtardan çok daha kısa ömürlü olmalıdır.</w:t>
       </w:r>
     </w:p>
-    <w:bookmarkEnd w:id="86"/>
-    <w:bookmarkStart w:id="90" w:name="anahtar-hiyerarşisi-her-işe-ayrı-anahtar"/>
+    <w:bookmarkEnd w:id="98"/>
+    <w:bookmarkStart w:id="102" w:name="anahtar-hiyerarşisi-her-işe-ayrı-anahtar"/>
     <w:p>
       <w:pPr>
         <w:pStyle w:val="Heading3"/>
@@ -23555,18 +23743,18 @@
           <wp:inline>
             <wp:extent cx="5759999" cy="2654976"/>
             <wp:effectExtent b="0" l="0" r="0" t="0"/>
-            <wp:docPr descr="Kök anahtardan KEK, DEK ve oturum anahtarlarına hiyerarşi" title="" id="88" name="Picture"/>
+            <wp:docPr descr="Kök anahtardan KEK, DEK ve oturum anahtarlarına hiyerarşi" title="" id="100" name="Picture"/>
             <a:graphic>
               <a:graphicData uri="http://schemas.openxmlformats.org/drawingml/2006/picture">
                 <pic:pic>
                   <pic:nvPicPr>
-                    <pic:cNvPr descr="h03-05-anahtar-hiyerarsisi.png" id="89" name="Picture"/>
+                    <pic:cNvPr descr="h03-05-anahtar-hiyerarsisi.png" id="101" name="Picture"/>
                     <pic:cNvPicPr>
                       <a:picLocks noChangeArrowheads="1" noChangeAspect="1"/>
                     </pic:cNvPicPr>
                   </pic:nvPicPr>
                   <pic:blipFill>
-                    <a:blip r:embed="rId87"/>
+                    <a:blip r:embed="rId99"/>
                     <a:stretch>
                       <a:fillRect/>
                     </a:stretch>
@@ -23806,8 +23994,8 @@
         <w:t xml:space="preserve">saldırganın elinde birkaç işlemlik anahtar vardır ve bunlar sunucuda kolayca iptal edilir.</w:t>
       </w:r>
     </w:p>
-    <w:bookmarkEnd w:id="90"/>
-    <w:bookmarkStart w:id="94" w:name="zarflama-envelope-encryption"/>
+    <w:bookmarkEnd w:id="102"/>
+    <w:bookmarkStart w:id="106" w:name="zarflama-envelope-encryption"/>
     <w:p>
       <w:pPr>
         <w:pStyle w:val="Heading3"/>
@@ -23855,18 +24043,18 @@
           <wp:inline>
             <wp:extent cx="5759999" cy="2377094"/>
             <wp:effectExtent b="0" l="0" r="0" t="0"/>
-            <wp:docPr descr="Zarflama: veriyi DEK, DEK’i KEK şifreler" title="" id="92" name="Picture"/>
+            <wp:docPr descr="Zarflama: veriyi DEK, DEK’i KEK şifreler" title="" id="104" name="Picture"/>
             <a:graphic>
               <a:graphicData uri="http://schemas.openxmlformats.org/drawingml/2006/picture">
                 <pic:pic>
                   <pic:nvPicPr>
-                    <pic:cNvPr descr="h03-09-zarflama.png" id="93" name="Picture"/>
+                    <pic:cNvPr descr="h03-09-zarflama.png" id="105" name="Picture"/>
                     <pic:cNvPicPr>
                       <a:picLocks noChangeArrowheads="1" noChangeAspect="1"/>
                     </pic:cNvPicPr>
                   </pic:nvPicPr>
                   <pic:blipFill>
-                    <a:blip r:embed="rId91"/>
+                    <a:blip r:embed="rId103"/>
                     <a:stretch>
                       <a:fillRect/>
                     </a:stretch>
@@ -23981,8 +24169,8 @@
         <w:t xml:space="preserve">Bulut sağlayıcılarının anahtar yönetim hizmetleri (KMS) ve disk şifreleme sistemleri bu yöntemi kullanır.</w:t>
       </w:r>
     </w:p>
-    <w:bookmarkEnd w:id="94"/>
-    <w:bookmarkStart w:id="98" w:name="X38c17c7d5a41993f3563adafc382770aa21b82f"/>
+    <w:bookmarkEnd w:id="106"/>
+    <w:bookmarkStart w:id="110" w:name="X38c17c7d5a41993f3563adafc382770aa21b82f"/>
     <w:p>
       <w:pPr>
         <w:pStyle w:val="Heading3"/>
@@ -24046,18 +24234,18 @@
           <wp:inline>
             <wp:extent cx="5759999" cy="2189826"/>
             <wp:effectExtent b="0" l="0" r="0" t="0"/>
-            <wp:docPr descr="Şifreli kayıt biçimi ve AAD kapsamı" title="" id="96" name="Picture"/>
+            <wp:docPr descr="Şifreli kayıt biçimi ve AAD kapsamı" title="" id="108" name="Picture"/>
             <a:graphic>
               <a:graphicData uri="http://schemas.openxmlformats.org/drawingml/2006/picture">
                 <pic:pic>
                   <pic:nvPicPr>
-                    <pic:cNvPr descr="h03-10-kayit-bicimi.png" id="97" name="Picture"/>
+                    <pic:cNvPr descr="h03-10-kayit-bicimi.png" id="109" name="Picture"/>
                     <pic:cNvPicPr>
                       <a:picLocks noChangeArrowheads="1" noChangeAspect="1"/>
                     </pic:cNvPicPr>
                   </pic:nvPicPr>
                   <pic:blipFill>
-                    <a:blip r:embed="rId95"/>
+                    <a:blip r:embed="rId107"/>
                     <a:stretch>
                       <a:fillRect/>
                     </a:stretch>
@@ -24104,8 +24292,8 @@
         <w:t xml:space="preserve">alanını değiştirip uygulamayı eski, zayıf bir anahtara yönlendiremez.</w:t>
       </w:r>
     </w:p>
-    <w:bookmarkEnd w:id="98"/>
-    <w:bookmarkStart w:id="99" w:name="anahtarı-nerede-saklamalı"/>
+    <w:bookmarkEnd w:id="110"/>
+    <w:bookmarkStart w:id="111" w:name="anahtarı-nerede-saklamalı"/>
     <w:p>
       <w:pPr>
         <w:pStyle w:val="Heading3"/>
@@ -24961,8 +25149,8 @@
         <w:t xml:space="preserve">}</w:t>
       </w:r>
     </w:p>
-    <w:bookmarkEnd w:id="99"/>
-    <w:bookmarkStart w:id="100" w:name="X1d0aa8e9c7cc526fbe064865f00634eda27adcd"/>
+    <w:bookmarkEnd w:id="111"/>
+    <w:bookmarkStart w:id="112" w:name="X1d0aa8e9c7cc526fbe064865f00634eda27adcd"/>
     <w:p>
       <w:pPr>
         <w:pStyle w:val="Heading3"/>
@@ -25637,8 +25825,8 @@
         <w:t xml:space="preserve">değerlidir; saldırı yüzeyini daraltır.</w:t>
       </w:r>
     </w:p>
-    <w:bookmarkEnd w:id="100"/>
-    <w:bookmarkStart w:id="101" w:name="Xaf5baa9d29503220af27426b50a83d28dfff0d4"/>
+    <w:bookmarkEnd w:id="112"/>
+    <w:bookmarkStart w:id="113" w:name="Xaf5baa9d29503220af27426b50a83d28dfff0d4"/>
     <w:p>
       <w:pPr>
         <w:pStyle w:val="Heading3"/>
@@ -26220,9 +26408,9 @@
         </w:pict>
       </w:r>
     </w:p>
-    <w:bookmarkEnd w:id="101"/>
-    <w:bookmarkEnd w:id="102"/>
-    <w:bookmarkStart w:id="111" w:name="X82e434b677e3f2888fa94745bfaadc512ae92ad"/>
+    <w:bookmarkEnd w:id="113"/>
+    <w:bookmarkEnd w:id="114"/>
+    <w:bookmarkStart w:id="123" w:name="X82e434b677e3f2888fa94745bfaadc512ae92ad"/>
     <w:p>
       <w:pPr>
         <w:pStyle w:val="Heading2"/>
@@ -26274,7 +26462,7 @@
         <w:t xml:space="preserve">TLS 1.0/1.1 kırık kabul edilir ve bırakılmıştır (POODLE, BEAST gibi saldırılar).</w:t>
       </w:r>
     </w:p>
-    <w:bookmarkStart w:id="106" w:name="tls-1.3-el-sıkışması"/>
+    <w:bookmarkStart w:id="118" w:name="tls-1.3-el-sıkışması"/>
     <w:p>
       <w:pPr>
         <w:pStyle w:val="Heading3"/>
@@ -26292,18 +26480,18 @@
           <wp:inline>
             <wp:extent cx="5759999" cy="3307393"/>
             <wp:effectExtent b="0" l="0" r="0" t="0"/>
-            <wp:docPr descr="TLS 1.3 el sıkışması adımları ve sertifika doğrulama" title="" id="104" name="Picture"/>
+            <wp:docPr descr="TLS 1.3 el sıkışması adımları ve sertifika doğrulama" title="" id="116" name="Picture"/>
             <a:graphic>
               <a:graphicData uri="http://schemas.openxmlformats.org/drawingml/2006/picture">
                 <pic:pic>
                   <pic:nvPicPr>
-                    <pic:cNvPr descr="h03-06-tls13.png" id="105" name="Picture"/>
+                    <pic:cNvPr descr="h03-06-tls13.png" id="117" name="Picture"/>
                     <pic:cNvPicPr>
                       <a:picLocks noChangeArrowheads="1" noChangeAspect="1"/>
                     </pic:cNvPicPr>
                   </pic:nvPicPr>
                   <pic:blipFill>
-                    <a:blip r:embed="rId103"/>
+                    <a:blip r:embed="rId115"/>
                     <a:stretch>
                       <a:fillRect/>
                     </a:stretch>
@@ -26386,8 +26574,8 @@
         <w:t xml:space="preserve">varsayılan olarak açıktır (RFC 8446).</w:t>
       </w:r>
     </w:p>
-    <w:bookmarkEnd w:id="106"/>
-    <w:bookmarkStart w:id="107" w:name="X3061f7f3c6aa15a9a29992e5346fe6a1e51fc54"/>
+    <w:bookmarkEnd w:id="118"/>
+    <w:bookmarkStart w:id="119" w:name="X3061f7f3c6aa15a9a29992e5346fe6a1e51fc54"/>
     <w:p>
       <w:pPr>
         <w:pStyle w:val="Heading3"/>
@@ -26924,8 +27112,8 @@
         <w:t xml:space="preserve">’da ayrıntılı işleyeceğiz.</w:t>
       </w:r>
     </w:p>
-    <w:bookmarkEnd w:id="107"/>
-    <w:bookmarkStart w:id="108" w:name="sabitleme-pinning-ve-tofu"/>
+    <w:bookmarkEnd w:id="119"/>
+    <w:bookmarkStart w:id="120" w:name="sabitleme-pinning-ve-tofu"/>
     <w:p>
       <w:pPr>
         <w:pStyle w:val="Heading3"/>
@@ -27081,8 +27269,8 @@
         <w:t xml:space="preserve">girmeyi zorlaştırır.</w:t>
       </w:r>
     </w:p>
-    <w:bookmarkEnd w:id="108"/>
-    <w:bookmarkStart w:id="109" w:name="tls-1.2den-1.3e-ne-değişti"/>
+    <w:bookmarkEnd w:id="120"/>
+    <w:bookmarkStart w:id="121" w:name="tls-1.2den-1.3e-ne-değişti"/>
     <w:p>
       <w:pPr>
         <w:pStyle w:val="Heading3"/>
@@ -27431,8 +27619,8 @@
         <w:t xml:space="preserve">0-RTT kullanılmaz.</w:t>
       </w:r>
     </w:p>
-    <w:bookmarkEnd w:id="109"/>
-    <w:bookmarkStart w:id="110" w:name="X3338d77b06ce0d8b37dcb36166e52633ebb778b"/>
+    <w:bookmarkEnd w:id="121"/>
+    <w:bookmarkStart w:id="122" w:name="X3338d77b06ce0d8b37dcb36166e52633ebb778b"/>
     <w:p>
       <w:pPr>
         <w:pStyle w:val="Heading3"/>
@@ -28810,9 +28998,9 @@
         </w:pict>
       </w:r>
     </w:p>
-    <w:bookmarkEnd w:id="110"/>
-    <w:bookmarkEnd w:id="111"/>
-    <w:bookmarkStart w:id="119" w:name="X6b281311480085ae0f0c6a81ab290325f548660"/>
+    <w:bookmarkEnd w:id="122"/>
+    <w:bookmarkEnd w:id="123"/>
+    <w:bookmarkStart w:id="134" w:name="X6b281311480085ae0f0c6a81ab290325f548660"/>
     <w:p>
       <w:pPr>
         <w:pStyle w:val="Heading2"/>
@@ -28885,7 +29073,54 @@
         <w:t xml:space="preserve">aşağıdaki kod bu tariflerin OpenSSL 1.1.1/3.x’e güncellenmiş halidir.</w:t>
       </w:r>
     </w:p>
-    <w:bookmarkStart w:id="112" w:name="openssl-ile-doğru-bir-istemci-yedi-adım"/>
+    <w:p>
+      <w:pPr>
+        <w:pStyle w:val="BodyText"/>
+      </w:pPr>
+      <w:r>
+        <w:drawing>
+          <wp:inline>
+            <wp:extent cx="5759999" cy="2766688"/>
+            <wp:effectExtent b="0" l="0" r="0" t="0"/>
+            <wp:docPr descr="TLS istemcisini doğru kurmanın adımları" title="" id="125" name="Picture"/>
+            <a:graphic>
+              <a:graphicData uri="http://schemas.openxmlformats.org/drawingml/2006/picture">
+                <pic:pic>
+                  <pic:nvPicPr>
+                    <pic:cNvPr descr="h03-16-tls-istemci-adimlari.png" id="126" name="Picture"/>
+                    <pic:cNvPicPr>
+                      <a:picLocks noChangeArrowheads="1" noChangeAspect="1"/>
+                    </pic:cNvPicPr>
+                  </pic:nvPicPr>
+                  <pic:blipFill>
+                    <a:blip r:embed="rId124"/>
+                    <a:stretch>
+                      <a:fillRect/>
+                    </a:stretch>
+                  </pic:blipFill>
+                  <pic:spPr bwMode="auto">
+                    <a:xfrm>
+                      <a:off x="0" y="0"/>
+                      <a:ext cx="5759999" cy="2766688"/>
+                    </a:xfrm>
+                    <a:prstGeom prst="rect">
+                      <a:avLst/>
+                    </a:prstGeom>
+                    <a:noFill/>
+                    <a:ln w="9525">
+                      <a:noFill/>
+                      <a:headEnd/>
+                      <a:tailEnd/>
+                    </a:ln>
+                  </pic:spPr>
+                </pic:pic>
+              </a:graphicData>
+            </a:graphic>
+          </wp:inline>
+        </w:drawing>
+      </w:r>
+    </w:p>
+    <w:bookmarkStart w:id="127" w:name="openssl-ile-doğru-bir-istemci-yedi-adım"/>
     <w:p>
       <w:pPr>
         <w:pStyle w:val="Heading3"/>
@@ -30880,8 +31115,8 @@
         <w:t xml:space="preserve">çalışma, çok sayıda gerçek uygulamanın ve kütüphanenin tam olarak bu adımı atladığını göstermişti.</w:t>
       </w:r>
     </w:p>
-    <w:bookmarkEnd w:id="112"/>
-    <w:bookmarkStart w:id="113" w:name="sabitlemeyi-eklemek-spki-özeti"/>
+    <w:bookmarkEnd w:id="127"/>
+    <w:bookmarkStart w:id="128" w:name="sabitlemeyi-eklemek-spki-özeti"/>
     <w:p>
       <w:pPr>
         <w:pStyle w:val="Heading3"/>
@@ -32468,8 +32703,8 @@
         <w:t xml:space="preserve">base64</w:t>
       </w:r>
     </w:p>
-    <w:bookmarkEnd w:id="113"/>
-    <w:bookmarkStart w:id="114" w:name="sabitlemeyi-sahada-sürdürmek"/>
+    <w:bookmarkEnd w:id="128"/>
+    <w:bookmarkStart w:id="129" w:name="sabitlemeyi-sahada-sürdürmek"/>
     <w:p>
       <w:pPr>
         <w:pStyle w:val="Heading3"/>
@@ -32822,8 +33057,8 @@
         <w:t xml:space="preserve">olarak yazılır (1. hafta).</w:t>
       </w:r>
     </w:p>
-    <w:bookmarkEnd w:id="114"/>
-    <w:bookmarkStart w:id="115" w:name="windowsta-tls-winhttp-ve-schannel"/>
+    <w:bookmarkEnd w:id="129"/>
+    <w:bookmarkStart w:id="130" w:name="windowsta-tls-winhttp-ve-schannel"/>
     <w:p>
       <w:pPr>
         <w:pStyle w:val="Heading3"/>
@@ -33106,8 +33341,8 @@
         <w:t xml:space="preserve">sunucu sertifikası alınır ve açık anahtar bilgisinin özeti yukarıdaki gibi karşılaştırılır.</w:t>
       </w:r>
     </w:p>
-    <w:bookmarkEnd w:id="115"/>
-    <w:bookmarkStart w:id="116" w:name="X948f538c77a1755cf370a794f7933294c06683a"/>
+    <w:bookmarkEnd w:id="130"/>
+    <w:bookmarkStart w:id="131" w:name="X948f538c77a1755cf370a794f7933294c06683a"/>
     <w:p>
       <w:pPr>
         <w:pStyle w:val="Heading3"/>
@@ -34250,8 +34485,8 @@
         <w:t xml:space="preserve">günlük satırlarını ayrıca arayın: fail-open hatalarının neredeyse hepsi oradadır.</w:t>
       </w:r>
     </w:p>
-    <w:bookmarkEnd w:id="116"/>
-    <w:bookmarkStart w:id="117" w:name="gerçek-uygulamalarda-en-sık-tls-hataları"/>
+    <w:bookmarkEnd w:id="131"/>
+    <w:bookmarkStart w:id="132" w:name="gerçek-uygulamalarda-en-sık-tls-hataları"/>
     <w:p>
       <w:pPr>
         <w:pStyle w:val="Heading3"/>
@@ -34715,8 +34950,8 @@
         <w:t xml:space="preserve">şifreleme (güvenlik kabuğu) eklenir ve veri beklemede de şifrelenir.</w:t>
       </w:r>
     </w:p>
-    <w:bookmarkEnd w:id="117"/>
-    <w:bookmarkStart w:id="118" w:name="kendi-bağlantınızı-test-etmek"/>
+    <w:bookmarkEnd w:id="132"/>
+    <w:bookmarkStart w:id="133" w:name="kendi-bağlantınızı-test-etmek"/>
     <w:p>
       <w:pPr>
         <w:pStyle w:val="Heading3"/>
@@ -35102,9 +35337,9 @@
         </w:pict>
       </w:r>
     </w:p>
-    <w:bookmarkEnd w:id="118"/>
-    <w:bookmarkEnd w:id="119"/>
-    <w:bookmarkStart w:id="121" w:name="X321fa2f985e09a1e9f0485a5518cf36d8ab6bef"/>
+    <w:bookmarkEnd w:id="133"/>
+    <w:bookmarkEnd w:id="134"/>
+    <w:bookmarkStart w:id="139" w:name="X321fa2f985e09a1e9f0485a5518cf36d8ab6bef"/>
     <w:p>
       <w:pPr>
         <w:pStyle w:val="Heading2"/>
@@ -35141,6 +35376,53 @@
       </w:r>
       <w:r>
         <w:t xml:space="preserve">korumanın iki düzeyi vardır:</w:t>
+      </w:r>
+    </w:p>
+    <w:p>
+      <w:pPr>
+        <w:pStyle w:val="BodyText"/>
+      </w:pPr>
+      <w:r>
+        <w:drawing>
+          <wp:inline>
+            <wp:extent cx="5759999" cy="2574688"/>
+            <wp:effectExtent b="0" l="0" r="0" t="0"/>
+            <wp:docPr descr="Beklemede veri: disk ve alan şifreleme" title="" id="136" name="Picture"/>
+            <a:graphic>
+              <a:graphicData uri="http://schemas.openxmlformats.org/drawingml/2006/picture">
+                <pic:pic>
+                  <pic:nvPicPr>
+                    <pic:cNvPr descr="h03-17-beklemede-iki-duzey.png" id="137" name="Picture"/>
+                    <pic:cNvPicPr>
+                      <a:picLocks noChangeArrowheads="1" noChangeAspect="1"/>
+                    </pic:cNvPicPr>
+                  </pic:nvPicPr>
+                  <pic:blipFill>
+                    <a:blip r:embed="rId135"/>
+                    <a:stretch>
+                      <a:fillRect/>
+                    </a:stretch>
+                  </pic:blipFill>
+                  <pic:spPr bwMode="auto">
+                    <a:xfrm>
+                      <a:off x="0" y="0"/>
+                      <a:ext cx="5759999" cy="2574688"/>
+                    </a:xfrm>
+                    <a:prstGeom prst="rect">
+                      <a:avLst/>
+                    </a:prstGeom>
+                    <a:noFill/>
+                    <a:ln w="9525">
+                      <a:noFill/>
+                      <a:headEnd/>
+                      <a:tailEnd/>
+                    </a:ln>
+                  </pic:spPr>
+                </pic:pic>
+              </a:graphicData>
+            </a:graphic>
+          </wp:inline>
+        </w:drawing>
       </w:r>
     </w:p>
     <w:p>
@@ -35512,7 +35794,7 @@
         <w:t xml:space="preserve">.</w:t>
       </w:r>
     </w:p>
-    <w:bookmarkStart w:id="120" w:name="Xdc7418aee7c1f9757c1be4a54cf68e81c0cf2cb"/>
+    <w:bookmarkStart w:id="138" w:name="Xdc7418aee7c1f9757c1be4a54cf68e81c0cf2cb"/>
     <w:p>
       <w:pPr>
         <w:pStyle w:val="Heading3"/>
@@ -36120,9 +36402,9 @@
         </w:pict>
       </w:r>
     </w:p>
-    <w:bookmarkEnd w:id="120"/>
-    <w:bookmarkEnd w:id="121"/>
-    <w:bookmarkStart w:id="132" w:name="Xab84ee4643eab6082a5369215e4a34a15ede64f"/>
+    <w:bookmarkEnd w:id="138"/>
+    <w:bookmarkEnd w:id="139"/>
+    <w:bookmarkStart w:id="150" w:name="Xab84ee4643eab6082a5369215e4a34a15ede64f"/>
     <w:p>
       <w:pPr>
         <w:pStyle w:val="Heading2"/>
@@ -36214,7 +36496,7 @@
         <w:t xml:space="preserve">teknikleri açıkça ister.</w:t>
       </w:r>
     </w:p>
-    <w:bookmarkStart w:id="122" w:name="dört-temel-teknik"/>
+    <w:bookmarkStart w:id="140" w:name="dört-temel-teknik"/>
     <w:p>
       <w:pPr>
         <w:pStyle w:val="Heading3"/>
@@ -36595,8 +36877,8 @@
         <w:t xml:space="preserve">demekten çok daha güçlü bir iddiadır.</w:t>
       </w:r>
     </w:p>
-    <w:bookmarkEnd w:id="122"/>
-    <w:bookmarkStart w:id="123" w:name="gösterimde-maskeleme"/>
+    <w:bookmarkEnd w:id="140"/>
+    <w:bookmarkStart w:id="141" w:name="gösterimde-maskeleme"/>
     <w:p>
       <w:pPr>
         <w:pStyle w:val="Heading3"/>
@@ -37446,8 +37728,8 @@
         <w:t xml:space="preserve">ya da istemci belleğini inceleyen biri tam değeri görür. Doğrusu, istemciye zaten maskelenmiş değeri göndermektir.</w:t>
       </w:r>
     </w:p>
-    <w:bookmarkEnd w:id="123"/>
-    <w:bookmarkStart w:id="127" w:name="tokenizasyon"/>
+    <w:bookmarkEnd w:id="141"/>
+    <w:bookmarkStart w:id="145" w:name="tokenizasyon"/>
     <w:p>
       <w:pPr>
         <w:pStyle w:val="Heading3"/>
@@ -37465,18 +37747,18 @@
           <wp:inline>
             <wp:extent cx="5759999" cy="2935878"/>
             <wp:effectExtent b="0" l="0" r="0" t="0"/>
-            <wp:docPr descr="Tokenizasyon: gerçek kart numarası kasada, uygulamada belirteç" title="" id="125" name="Picture"/>
+            <wp:docPr descr="Tokenizasyon: gerçek kart numarası kasada, uygulamada belirteç" title="" id="143" name="Picture"/>
             <a:graphic>
               <a:graphicData uri="http://schemas.openxmlformats.org/drawingml/2006/picture">
                 <pic:pic>
                   <pic:nvPicPr>
-                    <pic:cNvPr descr="h03-07-tokenizasyon.png" id="126" name="Picture"/>
+                    <pic:cNvPr descr="h03-07-tokenizasyon.png" id="144" name="Picture"/>
                     <pic:cNvPicPr>
                       <a:picLocks noChangeArrowheads="1" noChangeAspect="1"/>
                     </pic:cNvPicPr>
                   </pic:nvPicPr>
                   <pic:blipFill>
-                    <a:blip r:embed="rId124"/>
+                    <a:blip r:embed="rId142"/>
                     <a:stretch>
                       <a:fillRect/>
                     </a:stretch>
@@ -37609,8 +37891,8 @@
         <w:t xml:space="preserve">(format-preserving encryption, NIST SP 800-38G’deki FF1 algoritması) aynı işi bir anahtar ve kasa olmadan yapar.</w:t>
       </w:r>
     </w:p>
-    <w:bookmarkEnd w:id="127"/>
-    <w:bookmarkStart w:id="128" w:name="takma-adlandırma-anahtarlı-özet"/>
+    <w:bookmarkEnd w:id="145"/>
+    <w:bookmarkStart w:id="146" w:name="takma-adlandırma-anahtarlı-özet"/>
     <w:p>
       <w:pPr>
         <w:pStyle w:val="Heading3"/>
@@ -37886,8 +38168,8 @@
         <w:t xml:space="preserve">imha edilirse, veri fiilen anonimleşir.</w:t>
       </w:r>
     </w:p>
-    <w:bookmarkEnd w:id="128"/>
-    <w:bookmarkStart w:id="129" w:name="test-ve-geliştirme-verisi"/>
+    <w:bookmarkEnd w:id="146"/>
+    <w:bookmarkStart w:id="147" w:name="test-ve-geliştirme-verisi"/>
     <w:p>
       <w:pPr>
         <w:pStyle w:val="Heading3"/>
@@ -37994,8 +38276,8 @@
         <w:t xml:space="preserve">Kullanışlıdır ama veri tabanında tam haliyle durmaya devam eder.</w:t>
       </w:r>
     </w:p>
-    <w:bookmarkEnd w:id="129"/>
-    <w:bookmarkStart w:id="130" w:name="X96cba95fd85f099450039d957863e7dd99addf9"/>
+    <w:bookmarkEnd w:id="147"/>
+    <w:bookmarkStart w:id="148" w:name="X96cba95fd85f099450039d957863e7dd99addf9"/>
     <w:p>
       <w:pPr>
         <w:pStyle w:val="Heading3"/>
@@ -39093,8 +39375,8 @@
         <w:t xml:space="preserve">yüzden tercih edilir (1. hafta ödünleşim kaydı).</w:t>
       </w:r>
     </w:p>
-    <w:bookmarkEnd w:id="130"/>
-    <w:bookmarkStart w:id="131" w:name="hangi-tekniği-ne-zaman"/>
+    <w:bookmarkEnd w:id="148"/>
+    <w:bookmarkStart w:id="149" w:name="hangi-tekniği-ne-zaman"/>
     <w:p>
       <w:pPr>
         <w:pStyle w:val="Heading3"/>
@@ -39393,9 +39675,9 @@
         </w:pict>
       </w:r>
     </w:p>
-    <w:bookmarkEnd w:id="131"/>
-    <w:bookmarkEnd w:id="132"/>
-    <w:bookmarkStart w:id="135" w:name="Xdf1cdb42d93341bc103c75375377ecd03a42059"/>
+    <w:bookmarkEnd w:id="149"/>
+    <w:bookmarkEnd w:id="150"/>
+    <w:bookmarkStart w:id="156" w:name="Xdf1cdb42d93341bc103c75375377ecd03a42059"/>
     <w:p>
       <w:pPr>
         <w:pStyle w:val="Heading2"/>
@@ -39478,6 +39760,53 @@
       </w:r>
       <w:r>
         <w:t xml:space="preserve">için ek katmanları kuruyoruz.</w:t>
+      </w:r>
+    </w:p>
+    <w:p>
+      <w:pPr>
+        <w:pStyle w:val="BodyText"/>
+      </w:pPr>
+      <w:r>
+        <w:drawing>
+          <wp:inline>
+            <wp:extent cx="5759999" cy="2766688"/>
+            <wp:effectExtent b="0" l="0" r="0" t="0"/>
+            <wp:docPr descr="Kullanımda veriyi koruyan katmanlar" title="" id="152" name="Picture"/>
+            <a:graphic>
+              <a:graphicData uri="http://schemas.openxmlformats.org/drawingml/2006/picture">
+                <pic:pic>
+                  <pic:nvPicPr>
+                    <pic:cNvPr descr="h03-18-kullanimda-veri-katmanlari.png" id="153" name="Picture"/>
+                    <pic:cNvPicPr>
+                      <a:picLocks noChangeArrowheads="1" noChangeAspect="1"/>
+                    </pic:cNvPicPr>
+                  </pic:nvPicPr>
+                  <pic:blipFill>
+                    <a:blip r:embed="rId151"/>
+                    <a:stretch>
+                      <a:fillRect/>
+                    </a:stretch>
+                  </pic:blipFill>
+                  <pic:spPr bwMode="auto">
+                    <a:xfrm>
+                      <a:off x="0" y="0"/>
+                      <a:ext cx="5759999" cy="2766688"/>
+                    </a:xfrm>
+                    <a:prstGeom prst="rect">
+                      <a:avLst/>
+                    </a:prstGeom>
+                    <a:noFill/>
+                    <a:ln w="9525">
+                      <a:noFill/>
+                      <a:headEnd/>
+                      <a:tailEnd/>
+                    </a:ln>
+                  </pic:spPr>
+                </pic:pic>
+              </a:graphicData>
+            </a:graphic>
+          </wp:inline>
+        </w:drawing>
       </w:r>
     </w:p>
     <w:tbl>
@@ -39745,7 +40074,7 @@
         </w:tc>
       </w:tr>
     </w:tbl>
-    <w:bookmarkStart w:id="133" w:name="demo-8-mlock-güvenli-silme"/>
+    <w:bookmarkStart w:id="154" w:name="demo-8-mlock-güvenli-silme"/>
     <w:p>
       <w:pPr>
         <w:pStyle w:val="Heading3"/>
@@ -40067,8 +40396,8 @@
         <w:t xml:space="preserve">ile sayar).</w:t>
       </w:r>
     </w:p>
-    <w:bookmarkEnd w:id="133"/>
-    <w:bookmarkStart w:id="134" w:name="cihaz-bağlama"/>
+    <w:bookmarkEnd w:id="154"/>
+    <w:bookmarkStart w:id="155" w:name="cihaz-bağlama"/>
     <w:p>
       <w:pPr>
         <w:pStyle w:val="Heading3"/>
@@ -40443,9 +40772,9 @@
         </w:pict>
       </w:r>
     </w:p>
-    <w:bookmarkEnd w:id="134"/>
-    <w:bookmarkEnd w:id="135"/>
-    <w:bookmarkStart w:id="141" w:name="X978bdbbf7f695f44283a2c6008adad8a80f9060"/>
+    <w:bookmarkEnd w:id="155"/>
+    <w:bookmarkEnd w:id="156"/>
+    <w:bookmarkStart w:id="162" w:name="X978bdbbf7f695f44283a2c6008adad8a80f9060"/>
     <w:p>
       <w:pPr>
         <w:pStyle w:val="Heading2"/>
@@ -40509,18 +40838,18 @@
           <wp:inline>
             <wp:extent cx="5759999" cy="3638557"/>
             <wp:effectExtent b="0" l="0" r="0" t="0"/>
-            <wp:docPr descr="Sırrı saran dört güvenlik kabuğu" title="" id="137" name="Picture"/>
+            <wp:docPr descr="Sırrı saran dört güvenlik kabuğu" title="" id="158" name="Picture"/>
             <a:graphic>
               <a:graphicData uri="http://schemas.openxmlformats.org/drawingml/2006/picture">
                 <pic:pic>
                   <pic:nvPicPr>
-                    <pic:cNvPr descr="h03-08-guvenlik-kabuklari.png" id="138" name="Picture"/>
+                    <pic:cNvPr descr="h03-08-guvenlik-kabuklari.png" id="159" name="Picture"/>
                     <pic:cNvPicPr>
                       <a:picLocks noChangeArrowheads="1" noChangeAspect="1"/>
                     </pic:cNvPicPr>
                   </pic:nvPicPr>
                   <pic:blipFill>
-                    <a:blip r:embed="rId136"/>
+                    <a:blip r:embed="rId157"/>
                     <a:stretch>
                       <a:fillRect/>
                     </a:stretch>
@@ -40626,7 +40955,7 @@
         <w:t xml:space="preserve">ilkelerinin tek tabloda birleşmiş hâlidir.</w:t>
       </w:r>
     </w:p>
-    <w:bookmarkStart w:id="139" w:name="X3479cfb8403a7d1466110c9527bbc8d4b365d4f"/>
+    <w:bookmarkStart w:id="160" w:name="X3479cfb8403a7d1466110c9527bbc8d4b365d4f"/>
     <w:p>
       <w:pPr>
         <w:pStyle w:val="Heading3"/>
@@ -40967,8 +41296,8 @@
         <w:t xml:space="preserve">somutlaştırır.</w:t>
       </w:r>
     </w:p>
-    <w:bookmarkEnd w:id="139"/>
-    <w:bookmarkStart w:id="140" w:name="Xfebd1c8a968c93052f3a29952b8a62a8753ca3d"/>
+    <w:bookmarkEnd w:id="160"/>
+    <w:bookmarkStart w:id="161" w:name="Xfebd1c8a968c93052f3a29952b8a62a8753ca3d"/>
     <w:p>
       <w:pPr>
         <w:pStyle w:val="Heading3"/>
@@ -42153,9 +42482,9 @@
         </w:pict>
       </w:r>
     </w:p>
-    <w:bookmarkEnd w:id="140"/>
-    <w:bookmarkEnd w:id="141"/>
-    <w:bookmarkStart w:id="142" w:name="whitebox-kriptografiye-giriş-motivasyon"/>
+    <w:bookmarkEnd w:id="161"/>
+    <w:bookmarkEnd w:id="162"/>
+    <w:bookmarkStart w:id="166" w:name="whitebox-kriptografiye-giriş-motivasyon"/>
     <w:p>
       <w:pPr>
         <w:pStyle w:val="Heading2"/>
@@ -42214,6 +42543,53 @@
       </w:r>
       <w:r>
         <w:t xml:space="preserve">ama kapatmaz.</w:t>
+      </w:r>
+    </w:p>
+    <w:p>
+      <w:pPr>
+        <w:pStyle w:val="BodyText"/>
+      </w:pPr>
+      <w:r>
+        <w:drawing>
+          <wp:inline>
+            <wp:extent cx="5759999" cy="2283460"/>
+            <wp:effectExtent b="0" l="0" r="0" t="0"/>
+            <wp:docPr descr="Whitebox kriptografiye giden yol" title="" id="164" name="Picture"/>
+            <a:graphic>
+              <a:graphicData uri="http://schemas.openxmlformats.org/drawingml/2006/picture">
+                <pic:pic>
+                  <pic:nvPicPr>
+                    <pic:cNvPr descr="h03-19-whitebox-motivasyon.png" id="165" name="Picture"/>
+                    <pic:cNvPicPr>
+                      <a:picLocks noChangeArrowheads="1" noChangeAspect="1"/>
+                    </pic:cNvPicPr>
+                  </pic:nvPicPr>
+                  <pic:blipFill>
+                    <a:blip r:embed="rId163"/>
+                    <a:stretch>
+                      <a:fillRect/>
+                    </a:stretch>
+                  </pic:blipFill>
+                  <pic:spPr bwMode="auto">
+                    <a:xfrm>
+                      <a:off x="0" y="0"/>
+                      <a:ext cx="5759999" cy="2283460"/>
+                    </a:xfrm>
+                    <a:prstGeom prst="rect">
+                      <a:avLst/>
+                    </a:prstGeom>
+                    <a:noFill/>
+                    <a:ln w="9525">
+                      <a:noFill/>
+                      <a:headEnd/>
+                      <a:tailEnd/>
+                    </a:ln>
+                  </pic:spPr>
+                </pic:pic>
+              </a:graphicData>
+            </a:graphic>
+          </wp:inline>
+        </w:drawing>
       </w:r>
     </w:p>
     <w:p>
@@ -42441,8 +42817,8 @@
         </w:pict>
       </w:r>
     </w:p>
-    <w:bookmarkEnd w:id="142"/>
-    <w:bookmarkStart w:id="143" w:name="yaygın-yanlış-anlamalar"/>
+    <w:bookmarkEnd w:id="166"/>
+    <w:bookmarkStart w:id="170" w:name="yaygın-yanlış-anlamalar"/>
     <w:p>
       <w:pPr>
         <w:pStyle w:val="Heading2"/>
@@ -42455,6 +42831,51 @@
       <w:pPr>
         <w:pStyle w:val="FirstParagraph"/>
       </w:pPr>
+      <w:r>
+        <w:drawing>
+          <wp:inline>
+            <wp:extent cx="5759999" cy="2748610"/>
+            <wp:effectExtent b="0" l="0" r="0" t="0"/>
+            <wp:docPr descr="Dört yaygın yanlış anlama" title="" id="168" name="Picture"/>
+            <a:graphic>
+              <a:graphicData uri="http://schemas.openxmlformats.org/drawingml/2006/picture">
+                <pic:pic>
+                  <pic:nvPicPr>
+                    <pic:cNvPr descr="h03-20-yanlis-anlamalar.png" id="169" name="Picture"/>
+                    <pic:cNvPicPr>
+                      <a:picLocks noChangeArrowheads="1" noChangeAspect="1"/>
+                    </pic:cNvPicPr>
+                  </pic:nvPicPr>
+                  <pic:blipFill>
+                    <a:blip r:embed="rId167"/>
+                    <a:stretch>
+                      <a:fillRect/>
+                    </a:stretch>
+                  </pic:blipFill>
+                  <pic:spPr bwMode="auto">
+                    <a:xfrm>
+                      <a:off x="0" y="0"/>
+                      <a:ext cx="5759999" cy="2748610"/>
+                    </a:xfrm>
+                    <a:prstGeom prst="rect">
+                      <a:avLst/>
+                    </a:prstGeom>
+                    <a:noFill/>
+                    <a:ln w="9525">
+                      <a:noFill/>
+                      <a:headEnd/>
+                      <a:tailEnd/>
+                    </a:ln>
+                  </pic:spPr>
+                </pic:pic>
+              </a:graphicData>
+            </a:graphic>
+          </wp:inline>
+        </w:drawing>
+      </w:r>
+      <w:r>
+        <w:t xml:space="preserve"> </w:t>
+      </w:r>
       <w:r>
         <w:t xml:space="preserve">!!! failure</w:t>
       </w:r>
@@ -42706,8 +43127,8 @@
         </w:pict>
       </w:r>
     </w:p>
-    <w:bookmarkEnd w:id="143"/>
-    <w:bookmarkStart w:id="144" w:name="dönem-projesi-bu-hafta"/>
+    <w:bookmarkEnd w:id="170"/>
+    <w:bookmarkStart w:id="171" w:name="dönem-projesi-bu-hafta"/>
     <w:p>
       <w:pPr>
         <w:pStyle w:val="Heading2"/>
@@ -43493,8 +43914,8 @@
         </w:pict>
       </w:r>
     </w:p>
-    <w:bookmarkEnd w:id="144"/>
-    <w:bookmarkStart w:id="145" w:name="sınıf-etkinlikleri"/>
+    <w:bookmarkEnd w:id="171"/>
+    <w:bookmarkStart w:id="172" w:name="sınıf-etkinlikleri"/>
     <w:p>
       <w:pPr>
         <w:pStyle w:val="Heading2"/>
@@ -43752,8 +44173,8 @@
         </w:pict>
       </w:r>
     </w:p>
-    <w:bookmarkEnd w:id="145"/>
-    <w:bookmarkStart w:id="146" w:name="kod-okuma-alıştırmaları"/>
+    <w:bookmarkEnd w:id="172"/>
+    <w:bookmarkStart w:id="173" w:name="kod-okuma-alıştırmaları"/>
     <w:p>
       <w:pPr>
         <w:pStyle w:val="Heading2"/>
@@ -44589,8 +45010,8 @@
         </w:pict>
       </w:r>
     </w:p>
-    <w:bookmarkEnd w:id="146"/>
-    <w:bookmarkStart w:id="147" w:name="kendi-başına-çalış"/>
+    <w:bookmarkEnd w:id="173"/>
+    <w:bookmarkStart w:id="174" w:name="kendi-başına-çalış"/>
     <w:p>
       <w:pPr>
         <w:pStyle w:val="Heading2"/>
@@ -45788,8 +46209,8 @@
         </w:pict>
       </w:r>
     </w:p>
-    <w:bookmarkEnd w:id="147"/>
-    <w:bookmarkStart w:id="148" w:name="kendini-sınama"/>
+    <w:bookmarkEnd w:id="174"/>
+    <w:bookmarkStart w:id="175" w:name="kendini-sınama"/>
     <w:p>
       <w:pPr>
         <w:pStyle w:val="Heading2"/>
@@ -47012,8 +47433,8 @@
         </w:pict>
       </w:r>
     </w:p>
-    <w:bookmarkEnd w:id="148"/>
-    <w:bookmarkStart w:id="149" w:name="quiz-1-tarzı-örnek-sorular"/>
+    <w:bookmarkEnd w:id="175"/>
+    <w:bookmarkStart w:id="176" w:name="quiz-1-tarzı-örnek-sorular"/>
     <w:p>
       <w:pPr>
         <w:pStyle w:val="Heading2"/>
@@ -47260,8 +47681,8 @@
         </w:pict>
       </w:r>
     </w:p>
-    <w:bookmarkEnd w:id="149"/>
-    <w:bookmarkStart w:id="150" w:name="kaynaklar-ve-ileri-okuma"/>
+    <w:bookmarkEnd w:id="176"/>
+    <w:bookmarkStart w:id="177" w:name="kaynaklar-ve-ileri-okuma"/>
     <w:p>
       <w:pPr>
         <w:pStyle w:val="Heading2"/>
@@ -48239,8 +48660,8 @@
         </w:tc>
       </w:tr>
     </w:tbl>
-    <w:bookmarkEnd w:id="150"/>
-    <w:bookmarkEnd w:id="151"/>
+    <w:bookmarkEnd w:id="177"/>
+    <w:bookmarkEnd w:id="178"/>
     <w:sectPr>
       <w:headerReference r:id="rId9" w:type="default"/>
       <w:footerReference r:id="rId10" w:type="default"/>

</xml_diff>